<commit_message>
v0.1.18 - sections PS et Annexes
</commit_message>
<xml_diff>
--- a/_extensions/lettre/docx/reference.docx
+++ b/_extensions/lettre/docx/reference.docx
@@ -1534,6 +1534,48 @@
       <w:lang w:val="en-US" w:eastAsia="en-US" w:bidi="ar-SA"/>
     </w:rPr>
   </w:style>
+  <w:style w:type="paragraph" w:styleId="LetterPS" w:customStyle="1">
+    <w:name w:val="Letter PS"/>
+    <w:qFormat/>
+    <w:pPr>
+      <w:widowControl/>
+      <w:suppressAutoHyphens w:val="true"/>
+      <w:bidi w:val="0"/>
+      <w:spacing w:before="480" w:after="120"/>
+      <w:jc w:val="both"/>
+    </w:pPr>
+    <w:rPr>
+      <w:rFonts w:ascii="Aptos" w:hAnsi="Aptos" w:eastAsia="Aptos" w:cs="" w:asciiTheme="minorHAnsi" w:cstheme="minorBidi" w:eastAsiaTheme="minorHAnsi" w:hAnsiTheme="minorHAnsi"/>
+      <w:b w:val="false"/>
+      <w:i w:val="false"/>
+      <w:color w:val="auto"/>
+      <w:kern w:val="0"/>
+      <w:sz w:val="22"/>
+      <w:szCs w:val="24"/>
+      <w:lang w:val="en-US" w:eastAsia="en-US" w:bidi="ar-SA"/>
+    </w:rPr>
+  </w:style>
+  <w:style w:type="paragraph" w:styleId="LetterAnnexes" w:customStyle="1">
+    <w:name w:val="Letter Annexes"/>
+    <w:qFormat/>
+    <w:pPr>
+      <w:widowControl/>
+      <w:suppressAutoHyphens w:val="true"/>
+      <w:bidi w:val="0"/>
+      <w:spacing w:before="240" w:after="120"/>
+      <w:jc w:val="both"/>
+    </w:pPr>
+    <w:rPr>
+      <w:rFonts w:ascii="Aptos" w:hAnsi="Aptos" w:eastAsia="Aptos" w:cs="" w:asciiTheme="minorHAnsi" w:cstheme="minorBidi" w:eastAsiaTheme="minorHAnsi" w:hAnsiTheme="minorHAnsi"/>
+      <w:b w:val="false"/>
+      <w:i w:val="false"/>
+      <w:color w:val="auto"/>
+      <w:kern w:val="0"/>
+      <w:sz w:val="22"/>
+      <w:szCs w:val="24"/>
+      <w:lang w:val="en-US" w:eastAsia="en-US" w:bidi="ar-SA"/>
+    </w:rPr>
+  </w:style>
   <w:style w:type="table" w:default="1" w:styleId="Table">
     <w:name w:val="Table"/>
     <w:basedOn w:val="TableNormal"/>

</xml_diff>